<commit_message>
O artigo reconhece o quarto registro na linhagem
A seção 3.4 já datava a quarta versão, mas a linhagem continuava dizendo que o
registro de 26 de agosto era o que governava decisões futuras. Desde 30 de
agosto não é: quem governa é o quarto degrau. Um artigo sobre datar decisão não
pode errar a data da própria decisão vigente.

Acrescentado também que a série de 2026 do quarto degrau é reconstrução e não
acompanhamento, para o leitor que abrir o site e vir quatro linhas onde o artigo
avalia três.

O manuscrito estourou o teto de 8.000 palavras do BTech com essas frases, e o
corte veio de redundância e não do limite: "ou seja" reexplicando o que a frase
anterior já dizia, "e nova contagem" onde a linhagem já diz que extensões não
herdam data, e "de forma independente" virando "independentemente". Fecha em
7.999.

Os documentos foram reconstruídos: o .docx estava um dia atrás do markdown e o
.pdf estava quatro dias atrás, sem as duas correções anteriores.
</commit_message>
<xml_diff>
--- a/outputs/Benevente_BTECH_Final.docx
+++ b/outputs/Benevente_BTECH_Final.docx
@@ -952,7 +952,7 @@
         <w:pStyle w:val="Normal"/>
       </w:pPr>
       <w:r>
-        <w:t>Desde agosto de 2026 o sistema opera sob uma política declarada. Em lugar de buscar a melhor configuração a cada ano, ela fixa três, congeladas antes da avaliação prospectiva: o conservador aloca 35% do patrimônio em renda variável entre doze emissores; o equilibrado, 55% entre oito; o arrojado, 75% entre cinco. Em todos, um quinto do orçamento de renda variável fica no IVVB11, fundo na B3 que replica o S&amp;P 500 em reais, definido pela política e não pelo escore; o saldo fica em caixa. A camada de proteção intranual atua apenas sobre a parcela doméstica, porque o sinal de estresse é calculado sobre o Ibovespa. O registro traz os hashes dos insumos, o assinante, o critério de falseamento e o início da amostra confirmatória, e nenhum parâmetro muda sem nova versão e nova contagem. Uma quarta versão (30/08/2026) acrescentou um degrau de 4%, fora desta avaliação. As Seções 4.1.1 e 4.1.2 documentam as duas revisões; a 5.1 traz o diagnóstico.</w:t>
+        <w:t>Desde agosto de 2026 o sistema opera sob uma política declarada. Em lugar de buscar a melhor configuração a cada ano, ela fixa três, congeladas antes da avaliação prospectiva: o conservador aloca 35% do patrimônio em renda variável entre doze emissores; o equilibrado, 55% entre oito; o arrojado, 75% entre cinco. Em todos, um quinto do orçamento de renda variável fica no IVVB11, fundo na B3 que replica o S&amp;P 500 em reais, definido pela política e não pelo escore; o saldo fica em caixa. A camada de proteção intranual atua apenas sobre a parcela doméstica, porque o sinal de estresse é calculado sobre o Ibovespa. O registro traz os hashes dos insumos, o assinante, o critério de falseamento e o início da amostra confirmatória, e nenhum parâmetro muda sem nova versão. A quarta versão acrescentou um degrau de 4%, fora desta avaliação: a série de 2026 dele é reconstrução, não acompanhamento. As Seções 4.1.1 e 4.1.2 documentam as duas revisões; a 5.1 traz o diagnóstico.</w:t>
       </w:r>
     </w:p>
     <w:p>
@@ -1214,7 +1214,7 @@
         <w:pStyle w:val="Normal"/>
       </w:pPr>
       <w:r>
-        <w:t>Três referências foram calculadas de forma independente.</w:t>
+        <w:t>Três referências foram calculadas independentemente.</w:t>
       </w:r>
     </w:p>
     <w:p>
@@ -1261,7 +1261,7 @@
         <w:pStyle w:val="Normal"/>
       </w:pPr>
       <w:r>
-        <w:t>O último comparador merece nota: em uma versão anterior, a série rotulada como MVO era numericamente idêntica à estratégia, ou seja, a estratégia estava sendo comparada a si mesma. O defeito foi encontrado na auditoria interna e corrigido com uma implementação independente, que passou a produzir resultados distintos, inclusive desfavoráveis à estratégia em um dos onze anos. Todos os comparadores usam as mesmas datas de início e fim da carteira.</w:t>
+        <w:t>O último comparador merece nota: em uma versão anterior, a série rotulada como MVO era numericamente idêntica à estratégia, que assim se comparava a si mesma. O defeito foi encontrado na auditoria interna e corrigido com uma implementação independente, que passou a produzir resultados distintos, inclusive desfavoráveis à estratégia em um dos onze anos. Todos os comparadores usam as mesmas datas de início e fim da carteira.</w:t>
       </w:r>
     </w:p>
     <w:p>
@@ -1317,7 +1317,7 @@
         <w:pStyle w:val="Normal"/>
       </w:pPr>
       <w:r>
-        <w:t>A linhagem tem quatro registros: o módulo de seleção anual, em 16 de agosto de 2026; a camada de proteção e o protocolo de acompanhamento, depois das respectivas mudanças; a política por perfil, em 25 de agosto; e a revisão do instrumento de caixa, em 26 de agosto, que é a que governa decisões futuras. Extensões não herdam a data dos registros anteriores. Para sustentar uma conclusão prospectiva, cada perfil precisa superar o próprio caixa declarado e o Ibovespa após custos e tributos, respeitar o critério de falseamento do registro e acumular ao menos três decisões anuais completas posteriores ao congelamento; a amostra confirmatória começa no primeiro pregão de 2027. Nenhuma observação prospectiva havia sido consumida quando a versão 3 substituiu a 2, e por isso a contagem não recomeçou — se já tivesse sido, teria recomeçado. Não existe resultado prospectivo na data deste artigo: a carteira de janeiro de 2026 antecede os registros e é carteira-sombra.</w:t>
+        <w:t>A linhagem tem cinco registros: o módulo de seleção anual, em 16 de agosto de 2026; a camada de proteção e o protocolo de acompanhamento, após as respectivas mudanças; a política por perfil, em 25 de agosto; a revisão do caixa, em 26 de agosto, que governa esta avaliação; e o quarto degrau, em 30 de agosto, que rege decisões futuras. Extensões não herdam a data dos registros anteriores. Para sustentar uma conclusão prospectiva, cada perfil precisa superar o próprio caixa declarado e o Ibovespa após custos e tributos, respeitar o critério de falseamento do registro e acumular ao menos três decisões anuais completas posteriores ao congelamento; a amostra confirmatória começa no primeiro pregão de 2027. Nenhuma observação prospectiva havia sido consumida quando a versão 3 substituiu a 2, e por isso a contagem não recomeçou — se já tivesse sido, teria recomeçado. Não existe resultado prospectivo na data deste artigo: a carteira de janeiro de 2026 antecede os registros e é carteira-sombra.</w:t>
       </w:r>
     </w:p>
     <w:p>

</xml_diff>

<commit_message>
Audit, lote 8: o artigo declara os quatro perfis e traz o ultraconservador na Tabela 2
</commit_message>
<xml_diff>
--- a/outputs/Benevente_BTECH_Final.docx
+++ b/outputs/Benevente_BTECH_Final.docx
@@ -59,7 +59,7 @@
         <w:ind w:firstLine="0"/>
       </w:pPr>
       <w:r>
-        <w:t>Decisões de carteira precisam permanecer explicáveis depois de executadas. Este trabalho constrói e avalia o Benevente, um sistema que registra, para cada decisão, os dados admitidos, a regra quantitativa vigente, a carteira proposta, a explicação e a aprovação humana. A pesquisa segue design science e combina testes funcionais, auditoria adversarial e diagnóstico sequencial de onze decisões anuais entre 2015 e 2025. A política avaliada declara três perfis, do conservador ao arrojado, com orçamento de renda variável, número de emissores e fração internacional congelados em registro público antes do período confirmatório, que começa em 2027. A declaração substituiu a busca de configurações depois de um experimento controlado: ampliar a seleção aninhada de 36 para 256 candidatos, com insumos idênticos, reduziu o retorno realizado em 2,63 pontos percentuais ao ano e levou o índice de Sharpe deflacionado de 0,957 a 0,777, abaixo do limiar de significância. Versão posterior trocou o caixa modelado por um instrumento comprável, e o retorno de cada perfil caiu entre 0,07 e 0,17 ponto ao ano (Seção 4.1.2). A auditoria dimensionou a dependência de proventos imputados, 13,9% da exposição acumulada a ações, e removê-los deixa o retorno em 16,55% ao ano, ainda acima do Ibovespa; recusou o selo de reconciliação externa após comparar 54 de 56 observações ativo-ano com a fonte primária, e manteve os intervalos de 95% do excesso cruzando zero contra caixa e Ibovespa. Os retornos históricos são, portanto, diagnóstico de desenvolvimento, não validação comercial. O modelo de linguagem não demonstrou ganho de retorno e permanece restrito à explicação. A contribuição não é a trilha de auditoria, e sim ligá-la a um protocolo congelado com critério de falseamento declarado.</w:t>
+        <w:t>Decisões de carteira precisam permanecer explicáveis depois de executadas. Este trabalho constrói e avalia o Benevente, um sistema que registra, para cada decisão, os dados admitidos, a regra quantitativa vigente, a carteira proposta, a explicação e a aprovação humana. A pesquisa segue design science e combina testes funcionais, auditoria adversarial e diagnóstico sequencial de onze decisões anuais entre 2015 e 2025. A política avaliada declara quatro perfis, do ultraconservador ao arrojado, com orçamento de renda variável, número de emissores e fração internacional congelados em registro público antes do período confirmatório, que começa em 2027. A declaração substituiu a busca de configurações depois de um experimento controlado: ampliar a seleção aninhada de 36 para 256 candidatos, com insumos idênticos, reduziu o retorno realizado em 2,63 pontos percentuais ao ano e levou o índice de Sharpe deflacionado de 0,957 a 0,777, abaixo do limiar de significância. Versão posterior trocou o caixa modelado por um instrumento comprável, e o retorno de cada perfil caiu entre 0,07 e 0,17 ponto ao ano (Seção 4.1.2). A auditoria dimensionou a dependência de proventos imputados, 13,9% da exposição acumulada a ações, e removê-los deixa o retorno em 16,55% ao ano, ainda acima do Ibovespa; recusou o selo de reconciliação externa após comparar 54 de 56 observações ativo-ano com a fonte primária, e manteve os intervalos de 95% do excesso cruzando zero contra caixa e Ibovespa. Os retornos históricos são, portanto, diagnóstico de desenvolvimento, não validação comercial. O modelo de linguagem não demonstrou ganho de retorno e permanece restrito à explicação. A contribuição não é a trilha de auditoria, e sim ligá-la a um protocolo congelado com critério de falseamento declarado.</w:t>
       </w:r>
     </w:p>
     <w:p>
@@ -944,15 +944,15 @@
         <w:pStyle w:val="Heading2"/>
       </w:pPr>
       <w:r>
-        <w:t>3.4 A POLÍTICA VIGENTE: TRÊS PERFIS DECLARADOS</w:t>
-      </w:r>
-    </w:p>
-    <w:p>
-      <w:pPr>
-        <w:pStyle w:val="Normal"/>
-      </w:pPr>
-      <w:r>
-        <w:t>Desde agosto de 2026 o sistema opera sob uma política declarada. Em lugar de buscar a melhor configuração a cada ano, ela fixa três, congeladas antes da avaliação prospectiva: o conservador aloca 35% do patrimônio em renda variável entre doze emissores; o equilibrado, 55% entre oito; o arrojado, 75% entre cinco. Em todos, um quinto do orçamento de renda variável fica no IVVB11, fundo na B3 que replica o S&amp;P 500 em reais, definido pela política e não pelo escore; o saldo fica em caixa. A camada de proteção intranual atua apenas sobre a parcela doméstica, porque o sinal de estresse é calculado sobre o Ibovespa. O registro traz os hashes dos insumos, o assinante, o critério de falseamento e o início da amostra confirmatória, e nenhum parâmetro muda sem nova versão. A quarta versão acrescentou um degrau de 4%, fora desta avaliação: a série de 2026 dele é reconstrução, não acompanhamento. As Seções 4.1.1 e 4.1.2 documentam as duas revisões; a 5.1 traz o diagnóstico.</w:t>
+        <w:t>3.4 A POLÍTICA VIGENTE: QUATRO PERFIS DECLARADOS</w:t>
+      </w:r>
+    </w:p>
+    <w:p>
+      <w:pPr>
+        <w:pStyle w:val="Normal"/>
+      </w:pPr>
+      <w:r>
+        <w:t>Desde agosto de 2026 o sistema opera sob uma política declarada. Em vez da busca anual, ela fixa quatro carteiras, congeladas antes da avaliação prospectiva: o ultraconservador aloca 4% do patrimônio em renda variável entre doze emissores; o conservador, 35% entre doze; o equilibrado, 55% entre oito; o arrojado, 75% entre cinco. Em todos, um quinto do orçamento de renda variável fica no IVVB11, fundo na B3 que replica o S&amp;P 500 em reais, definido pela política e não pelo escore; o saldo fica em caixa. A camada de proteção intranual atua apenas sobre a parcela doméstica, porque o sinal de estresse é calculado sobre o Ibovespa. O registro traz os hashes dos insumos, o assinante, o critério de falseamento e o início da amostra confirmatória, e nenhum parâmetro muda sem nova versão. O ultraconservador foi declarado em 30 de agosto de 2026, quatro dias depois dos outros três, e a amostra confirmatória dos quatro começa junto, em 2027. As séries de 2026 são reconstruções de agosto, com a política aplicada retroativamente a 2 de janeiro com os dados de então; nenhuma foi acompanhada desde janeiro. As Seções 4.1.1 e 4.1.2 documentam as duas revisões; a 5.1 traz o diagnóstico.</w:t>
       </w:r>
     </w:p>
     <w:p>
@@ -1301,7 +1301,7 @@
         <w:pStyle w:val="Normal"/>
       </w:pPr>
       <w:r>
-        <w:t>A reconstrução de retorno total combina 497 séries; em 139 delas a distribuição de proventos precisou ser imputada por falta de cobertura do provedor. Como uma série problemática pode nunca entrar na carteira, a auditoria cruzou por ano a política, os pesos e o tipo de reconstrução, e mede a parcela da exposição a ações que dependeu de provento imputado. Três testes de sensibilidade complementam a inspeção: a reamostragem conjunta dos vetores anuais, com 100 mil amostras e semente registrada, que mede estabilidade interna sem criar crises novas; perdas hipotéticas aplicadas apenas à parcela investida em séries imputadas; e a remoção dessas séries, com o orçamento delas no caixa e a contribuição medida de cada posição.</w:t>
+        <w:t>A reconstrução de retorno total combina 497 séries; em 139 delas a distribuição de proventos precisou ser imputada por falta de cobertura do provedor. A auditoria cruzou por ano a política, os pesos e o tipo de reconstrução, e mede a parcela da exposição a ações que dependeu de provento imputado. Três testes de sensibilidade complementam a inspeção: a reamostragem conjunta dos vetores anuais, com 100 mil amostras e semente registrada, que mede estabilidade interna sem criar crises novas; perdas hipotéticas aplicadas apenas à parcela investida em séries imputadas; e a remoção dessas séries, com o orçamento delas no caixa e a contribuição medida de cada posição.</w:t>
       </w:r>
     </w:p>
     <w:p>
@@ -1392,13 +1392,13 @@
         </w:tblBorders>
       </w:tblPr>
       <w:tblGrid>
-        <w:gridCol w:w="1072"/>
-        <w:gridCol w:w="1364"/>
+        <w:gridCol w:w="1479"/>
+        <w:gridCol w:w="1294"/>
         <w:gridCol w:w="900"/>
-        <w:gridCol w:w="1754"/>
-        <w:gridCol w:w="1169"/>
-        <w:gridCol w:w="1169"/>
-        <w:gridCol w:w="1632"/>
+        <w:gridCol w:w="1664"/>
+        <w:gridCol w:w="1109"/>
+        <w:gridCol w:w="1109"/>
+        <w:gridCol w:w="1505"/>
       </w:tblGrid>
       <w:tr>
         <w:trPr>
@@ -1407,7 +1407,7 @@
         </w:trPr>
         <w:tc>
           <w:tcPr>
-            <w:tcW w:type="dxa" w:w="1072"/>
+            <w:tcW w:type="dxa" w:w="1479"/>
             <w:vAlign w:val="center"/>
             <w:tcBorders>
               <w:bottom w:val="single" w:sz="8" w:color="000000"/>
@@ -1432,7 +1432,7 @@
         </w:tc>
         <w:tc>
           <w:tcPr>
-            <w:tcW w:type="dxa" w:w="1364"/>
+            <w:tcW w:type="dxa" w:w="1294"/>
             <w:vAlign w:val="center"/>
             <w:tcBorders>
               <w:bottom w:val="single" w:sz="8" w:color="000000"/>
@@ -1482,7 +1482,7 @@
         </w:tc>
         <w:tc>
           <w:tcPr>
-            <w:tcW w:type="dxa" w:w="1754"/>
+            <w:tcW w:type="dxa" w:w="1664"/>
             <w:vAlign w:val="center"/>
             <w:tcBorders>
               <w:bottom w:val="single" w:sz="8" w:color="000000"/>
@@ -1507,7 +1507,7 @@
         </w:tc>
         <w:tc>
           <w:tcPr>
-            <w:tcW w:type="dxa" w:w="1169"/>
+            <w:tcW w:type="dxa" w:w="1109"/>
             <w:vAlign w:val="center"/>
             <w:tcBorders>
               <w:bottom w:val="single" w:sz="8" w:color="000000"/>
@@ -1532,7 +1532,7 @@
         </w:tc>
         <w:tc>
           <w:tcPr>
-            <w:tcW w:type="dxa" w:w="1169"/>
+            <w:tcW w:type="dxa" w:w="1109"/>
             <w:vAlign w:val="center"/>
             <w:tcBorders>
               <w:bottom w:val="single" w:sz="8" w:color="000000"/>
@@ -1557,7 +1557,7 @@
         </w:tc>
         <w:tc>
           <w:tcPr>
-            <w:tcW w:type="dxa" w:w="1632"/>
+            <w:tcW w:type="dxa" w:w="1505"/>
             <w:vAlign w:val="center"/>
             <w:tcBorders>
               <w:bottom w:val="single" w:sz="8" w:color="000000"/>
@@ -1587,43 +1587,43 @@
         </w:trPr>
         <w:tc>
           <w:tcPr>
-            <w:tcW w:type="dxa" w:w="1072"/>
-            <w:vAlign w:val="center"/>
-          </w:tcPr>
-          <w:p>
-            <w:pPr>
-              <w:keepNext/>
-              <w:spacing w:line="240" w:lineRule="auto" w:after="0"/>
-              <w:ind w:firstLine="0"/>
-              <w:jc w:val="left"/>
-            </w:pPr>
-            <w:r>
-              <w:rPr>
-                <w:rFonts w:ascii="Times New Roman" w:hAnsi="Times New Roman"/>
-                <w:sz w:val="17"/>
-              </w:rPr>
-              <w:t>Conservador</w:t>
-            </w:r>
-          </w:p>
-        </w:tc>
-        <w:tc>
-          <w:tcPr>
-            <w:tcW w:type="dxa" w:w="1364"/>
-            <w:vAlign w:val="center"/>
-          </w:tcPr>
-          <w:p>
-            <w:pPr>
-              <w:keepNext/>
-              <w:spacing w:line="240" w:lineRule="auto" w:after="0"/>
-              <w:ind w:firstLine="0"/>
-              <w:jc w:val="left"/>
-            </w:pPr>
-            <w:r>
-              <w:rPr>
-                <w:rFonts w:ascii="Times New Roman" w:hAnsi="Times New Roman"/>
-                <w:sz w:val="17"/>
-              </w:rPr>
-              <w:t>35%</w:t>
+            <w:tcW w:type="dxa" w:w="1479"/>
+            <w:vAlign w:val="center"/>
+          </w:tcPr>
+          <w:p>
+            <w:pPr>
+              <w:keepNext/>
+              <w:spacing w:line="240" w:lineRule="auto" w:after="0"/>
+              <w:ind w:firstLine="0"/>
+              <w:jc w:val="left"/>
+            </w:pPr>
+            <w:r>
+              <w:rPr>
+                <w:rFonts w:ascii="Times New Roman" w:hAnsi="Times New Roman"/>
+                <w:sz w:val="17"/>
+              </w:rPr>
+              <w:t>Ultraconservador</w:t>
+            </w:r>
+          </w:p>
+        </w:tc>
+        <w:tc>
+          <w:tcPr>
+            <w:tcW w:type="dxa" w:w="1294"/>
+            <w:vAlign w:val="center"/>
+          </w:tcPr>
+          <w:p>
+            <w:pPr>
+              <w:keepNext/>
+              <w:spacing w:line="240" w:lineRule="auto" w:after="0"/>
+              <w:ind w:firstLine="0"/>
+              <w:jc w:val="left"/>
+            </w:pPr>
+            <w:r>
+              <w:rPr>
+                <w:rFonts w:ascii="Times New Roman" w:hAnsi="Times New Roman"/>
+                <w:sz w:val="17"/>
+              </w:rPr>
+              <w:t>4%</w:t>
             </w:r>
           </w:p>
         </w:tc>
@@ -1650,70 +1650,70 @@
         </w:tc>
         <w:tc>
           <w:tcPr>
-            <w:tcW w:type="dxa" w:w="1754"/>
-            <w:vAlign w:val="center"/>
-          </w:tcPr>
-          <w:p>
-            <w:pPr>
-              <w:keepNext/>
-              <w:spacing w:line="240" w:lineRule="auto" w:after="0"/>
-              <w:ind w:firstLine="0"/>
-              <w:jc w:val="left"/>
-            </w:pPr>
-            <w:r>
-              <w:rPr>
-                <w:rFonts w:ascii="Times New Roman" w:hAnsi="Times New Roman"/>
-                <w:sz w:val="17"/>
-              </w:rPr>
-              <w:t>12,51%</w:t>
-            </w:r>
-          </w:p>
-        </w:tc>
-        <w:tc>
-          <w:tcPr>
-            <w:tcW w:type="dxa" w:w="1169"/>
-            <w:vAlign w:val="center"/>
-          </w:tcPr>
-          <w:p>
-            <w:pPr>
-              <w:keepNext/>
-              <w:spacing w:line="240" w:lineRule="auto" w:after="0"/>
-              <w:ind w:firstLine="0"/>
-              <w:jc w:val="left"/>
-            </w:pPr>
-            <w:r>
-              <w:rPr>
-                <w:rFonts w:ascii="Times New Roman" w:hAnsi="Times New Roman"/>
-                <w:sz w:val="17"/>
-              </w:rPr>
-              <w:t>5,84%</w:t>
-            </w:r>
-          </w:p>
-        </w:tc>
-        <w:tc>
-          <w:tcPr>
-            <w:tcW w:type="dxa" w:w="1169"/>
-            <w:vAlign w:val="center"/>
-          </w:tcPr>
-          <w:p>
-            <w:pPr>
-              <w:keepNext/>
-              <w:spacing w:line="240" w:lineRule="auto" w:after="0"/>
-              <w:ind w:firstLine="0"/>
-              <w:jc w:val="left"/>
-            </w:pPr>
-            <w:r>
-              <w:rPr>
-                <w:rFonts w:ascii="Times New Roman" w:hAnsi="Times New Roman"/>
-                <w:sz w:val="17"/>
-              </w:rPr>
-              <w:t>−9,16%</w:t>
-            </w:r>
-          </w:p>
-        </w:tc>
-        <w:tc>
-          <w:tcPr>
-            <w:tcW w:type="dxa" w:w="1632"/>
+            <w:tcW w:type="dxa" w:w="1664"/>
+            <w:vAlign w:val="center"/>
+          </w:tcPr>
+          <w:p>
+            <w:pPr>
+              <w:keepNext/>
+              <w:spacing w:line="240" w:lineRule="auto" w:after="0"/>
+              <w:ind w:firstLine="0"/>
+              <w:jc w:val="left"/>
+            </w:pPr>
+            <w:r>
+              <w:rPr>
+                <w:rFonts w:ascii="Times New Roman" w:hAnsi="Times New Roman"/>
+                <w:sz w:val="17"/>
+              </w:rPr>
+              <w:t>9,73%</w:t>
+            </w:r>
+          </w:p>
+        </w:tc>
+        <w:tc>
+          <w:tcPr>
+            <w:tcW w:type="dxa" w:w="1109"/>
+            <w:vAlign w:val="center"/>
+          </w:tcPr>
+          <w:p>
+            <w:pPr>
+              <w:keepNext/>
+              <w:spacing w:line="240" w:lineRule="auto" w:after="0"/>
+              <w:ind w:firstLine="0"/>
+              <w:jc w:val="left"/>
+            </w:pPr>
+            <w:r>
+              <w:rPr>
+                <w:rFonts w:ascii="Times New Roman" w:hAnsi="Times New Roman"/>
+                <w:sz w:val="17"/>
+              </w:rPr>
+              <w:t>0,74%</w:t>
+            </w:r>
+          </w:p>
+        </w:tc>
+        <w:tc>
+          <w:tcPr>
+            <w:tcW w:type="dxa" w:w="1109"/>
+            <w:vAlign w:val="center"/>
+          </w:tcPr>
+          <w:p>
+            <w:pPr>
+              <w:keepNext/>
+              <w:spacing w:line="240" w:lineRule="auto" w:after="0"/>
+              <w:ind w:firstLine="0"/>
+              <w:jc w:val="left"/>
+            </w:pPr>
+            <w:r>
+              <w:rPr>
+                <w:rFonts w:ascii="Times New Roman" w:hAnsi="Times New Roman"/>
+                <w:sz w:val="17"/>
+              </w:rPr>
+              <w:t>−0,81%</w:t>
+            </w:r>
+          </w:p>
+        </w:tc>
+        <w:tc>
+          <w:tcPr>
+            <w:tcW w:type="dxa" w:w="1505"/>
             <w:vAlign w:val="center"/>
           </w:tcPr>
           <w:p>
@@ -1739,43 +1739,43 @@
         </w:trPr>
         <w:tc>
           <w:tcPr>
-            <w:tcW w:type="dxa" w:w="1072"/>
-            <w:vAlign w:val="center"/>
-          </w:tcPr>
-          <w:p>
-            <w:pPr>
-              <w:keepNext/>
-              <w:spacing w:line="240" w:lineRule="auto" w:after="0"/>
-              <w:ind w:firstLine="0"/>
-              <w:jc w:val="left"/>
-            </w:pPr>
-            <w:r>
-              <w:rPr>
-                <w:rFonts w:ascii="Times New Roman" w:hAnsi="Times New Roman"/>
-                <w:sz w:val="17"/>
-              </w:rPr>
-              <w:t>Equilibrado</w:t>
-            </w:r>
-          </w:p>
-        </w:tc>
-        <w:tc>
-          <w:tcPr>
-            <w:tcW w:type="dxa" w:w="1364"/>
-            <w:vAlign w:val="center"/>
-          </w:tcPr>
-          <w:p>
-            <w:pPr>
-              <w:keepNext/>
-              <w:spacing w:line="240" w:lineRule="auto" w:after="0"/>
-              <w:ind w:firstLine="0"/>
-              <w:jc w:val="left"/>
-            </w:pPr>
-            <w:r>
-              <w:rPr>
-                <w:rFonts w:ascii="Times New Roman" w:hAnsi="Times New Roman"/>
-                <w:sz w:val="17"/>
-              </w:rPr>
-              <w:t>55%</w:t>
+            <w:tcW w:type="dxa" w:w="1479"/>
+            <w:vAlign w:val="center"/>
+          </w:tcPr>
+          <w:p>
+            <w:pPr>
+              <w:keepNext/>
+              <w:spacing w:line="240" w:lineRule="auto" w:after="0"/>
+              <w:ind w:firstLine="0"/>
+              <w:jc w:val="left"/>
+            </w:pPr>
+            <w:r>
+              <w:rPr>
+                <w:rFonts w:ascii="Times New Roman" w:hAnsi="Times New Roman"/>
+                <w:sz w:val="17"/>
+              </w:rPr>
+              <w:t>Conservador</w:t>
+            </w:r>
+          </w:p>
+        </w:tc>
+        <w:tc>
+          <w:tcPr>
+            <w:tcW w:type="dxa" w:w="1294"/>
+            <w:vAlign w:val="center"/>
+          </w:tcPr>
+          <w:p>
+            <w:pPr>
+              <w:keepNext/>
+              <w:spacing w:line="240" w:lineRule="auto" w:after="0"/>
+              <w:ind w:firstLine="0"/>
+              <w:jc w:val="left"/>
+            </w:pPr>
+            <w:r>
+              <w:rPr>
+                <w:rFonts w:ascii="Times New Roman" w:hAnsi="Times New Roman"/>
+                <w:sz w:val="17"/>
+              </w:rPr>
+              <w:t>35%</w:t>
             </w:r>
           </w:p>
         </w:tc>
@@ -1796,76 +1796,76 @@
                 <w:rFonts w:ascii="Times New Roman" w:hAnsi="Times New Roman"/>
                 <w:sz w:val="17"/>
               </w:rPr>
-              <w:t>8</w:t>
-            </w:r>
-          </w:p>
-        </w:tc>
-        <w:tc>
-          <w:tcPr>
-            <w:tcW w:type="dxa" w:w="1754"/>
-            <w:vAlign w:val="center"/>
-          </w:tcPr>
-          <w:p>
-            <w:pPr>
-              <w:keepNext/>
-              <w:spacing w:line="240" w:lineRule="auto" w:after="0"/>
-              <w:ind w:firstLine="0"/>
-              <w:jc w:val="left"/>
-            </w:pPr>
-            <w:r>
-              <w:rPr>
-                <w:rFonts w:ascii="Times New Roman" w:hAnsi="Times New Roman"/>
-                <w:sz w:val="17"/>
-              </w:rPr>
-              <w:t>15,51%</w:t>
-            </w:r>
-          </w:p>
-        </w:tc>
-        <w:tc>
-          <w:tcPr>
-            <w:tcW w:type="dxa" w:w="1169"/>
-            <w:vAlign w:val="center"/>
-          </w:tcPr>
-          <w:p>
-            <w:pPr>
-              <w:keepNext/>
-              <w:spacing w:line="240" w:lineRule="auto" w:after="0"/>
-              <w:ind w:firstLine="0"/>
-              <w:jc w:val="left"/>
-            </w:pPr>
-            <w:r>
-              <w:rPr>
-                <w:rFonts w:ascii="Times New Roman" w:hAnsi="Times New Roman"/>
-                <w:sz w:val="17"/>
-              </w:rPr>
-              <w:t>10,51%</w:t>
-            </w:r>
-          </w:p>
-        </w:tc>
-        <w:tc>
-          <w:tcPr>
-            <w:tcW w:type="dxa" w:w="1169"/>
-            <w:vAlign w:val="center"/>
-          </w:tcPr>
-          <w:p>
-            <w:pPr>
-              <w:keepNext/>
-              <w:spacing w:line="240" w:lineRule="auto" w:after="0"/>
-              <w:ind w:firstLine="0"/>
-              <w:jc w:val="left"/>
-            </w:pPr>
-            <w:r>
-              <w:rPr>
-                <w:rFonts w:ascii="Times New Roman" w:hAnsi="Times New Roman"/>
-                <w:sz w:val="17"/>
-              </w:rPr>
-              <w:t>−17,86%</w:t>
-            </w:r>
-          </w:p>
-        </w:tc>
-        <w:tc>
-          <w:tcPr>
-            <w:tcW w:type="dxa" w:w="1632"/>
+              <w:t>12</w:t>
+            </w:r>
+          </w:p>
+        </w:tc>
+        <w:tc>
+          <w:tcPr>
+            <w:tcW w:type="dxa" w:w="1664"/>
+            <w:vAlign w:val="center"/>
+          </w:tcPr>
+          <w:p>
+            <w:pPr>
+              <w:keepNext/>
+              <w:spacing w:line="240" w:lineRule="auto" w:after="0"/>
+              <w:ind w:firstLine="0"/>
+              <w:jc w:val="left"/>
+            </w:pPr>
+            <w:r>
+              <w:rPr>
+                <w:rFonts w:ascii="Times New Roman" w:hAnsi="Times New Roman"/>
+                <w:sz w:val="17"/>
+              </w:rPr>
+              <w:t>12,34%</w:t>
+            </w:r>
+          </w:p>
+        </w:tc>
+        <w:tc>
+          <w:tcPr>
+            <w:tcW w:type="dxa" w:w="1109"/>
+            <w:vAlign w:val="center"/>
+          </w:tcPr>
+          <w:p>
+            <w:pPr>
+              <w:keepNext/>
+              <w:spacing w:line="240" w:lineRule="auto" w:after="0"/>
+              <w:ind w:firstLine="0"/>
+              <w:jc w:val="left"/>
+            </w:pPr>
+            <w:r>
+              <w:rPr>
+                <w:rFonts w:ascii="Times New Roman" w:hAnsi="Times New Roman"/>
+                <w:sz w:val="17"/>
+              </w:rPr>
+              <w:t>5,85%</w:t>
+            </w:r>
+          </w:p>
+        </w:tc>
+        <w:tc>
+          <w:tcPr>
+            <w:tcW w:type="dxa" w:w="1109"/>
+            <w:vAlign w:val="center"/>
+          </w:tcPr>
+          <w:p>
+            <w:pPr>
+              <w:keepNext/>
+              <w:spacing w:line="240" w:lineRule="auto" w:after="0"/>
+              <w:ind w:firstLine="0"/>
+              <w:jc w:val="left"/>
+            </w:pPr>
+            <w:r>
+              <w:rPr>
+                <w:rFonts w:ascii="Times New Roman" w:hAnsi="Times New Roman"/>
+                <w:sz w:val="17"/>
+              </w:rPr>
+              <w:t>−9,17%</w:t>
+            </w:r>
+          </w:p>
+        </w:tc>
+        <w:tc>
+          <w:tcPr>
+            <w:tcW w:type="dxa" w:w="1505"/>
             <w:vAlign w:val="center"/>
           </w:tcPr>
           <w:p>
@@ -1891,43 +1891,43 @@
         </w:trPr>
         <w:tc>
           <w:tcPr>
-            <w:tcW w:type="dxa" w:w="1072"/>
-            <w:vAlign w:val="center"/>
-          </w:tcPr>
-          <w:p>
-            <w:pPr>
-              <w:keepNext/>
-              <w:spacing w:line="240" w:lineRule="auto" w:after="0"/>
-              <w:ind w:firstLine="0"/>
-              <w:jc w:val="left"/>
-            </w:pPr>
-            <w:r>
-              <w:rPr>
-                <w:rFonts w:ascii="Times New Roman" w:hAnsi="Times New Roman"/>
-                <w:sz w:val="17"/>
-              </w:rPr>
-              <w:t>Arrojado</w:t>
-            </w:r>
-          </w:p>
-        </w:tc>
-        <w:tc>
-          <w:tcPr>
-            <w:tcW w:type="dxa" w:w="1364"/>
-            <w:vAlign w:val="center"/>
-          </w:tcPr>
-          <w:p>
-            <w:pPr>
-              <w:keepNext/>
-              <w:spacing w:line="240" w:lineRule="auto" w:after="0"/>
-              <w:ind w:firstLine="0"/>
-              <w:jc w:val="left"/>
-            </w:pPr>
-            <w:r>
-              <w:rPr>
-                <w:rFonts w:ascii="Times New Roman" w:hAnsi="Times New Roman"/>
-                <w:sz w:val="17"/>
-              </w:rPr>
-              <w:t>75%</w:t>
+            <w:tcW w:type="dxa" w:w="1479"/>
+            <w:vAlign w:val="center"/>
+          </w:tcPr>
+          <w:p>
+            <w:pPr>
+              <w:keepNext/>
+              <w:spacing w:line="240" w:lineRule="auto" w:after="0"/>
+              <w:ind w:firstLine="0"/>
+              <w:jc w:val="left"/>
+            </w:pPr>
+            <w:r>
+              <w:rPr>
+                <w:rFonts w:ascii="Times New Roman" w:hAnsi="Times New Roman"/>
+                <w:sz w:val="17"/>
+              </w:rPr>
+              <w:t>Equilibrado</w:t>
+            </w:r>
+          </w:p>
+        </w:tc>
+        <w:tc>
+          <w:tcPr>
+            <w:tcW w:type="dxa" w:w="1294"/>
+            <w:vAlign w:val="center"/>
+          </w:tcPr>
+          <w:p>
+            <w:pPr>
+              <w:keepNext/>
+              <w:spacing w:line="240" w:lineRule="auto" w:after="0"/>
+              <w:ind w:firstLine="0"/>
+              <w:jc w:val="left"/>
+            </w:pPr>
+            <w:r>
+              <w:rPr>
+                <w:rFonts w:ascii="Times New Roman" w:hAnsi="Times New Roman"/>
+                <w:sz w:val="17"/>
+              </w:rPr>
+              <w:t>55%</w:t>
             </w:r>
           </w:p>
         </w:tc>
@@ -1948,76 +1948,76 @@
                 <w:rFonts w:ascii="Times New Roman" w:hAnsi="Times New Roman"/>
                 <w:sz w:val="17"/>
               </w:rPr>
-              <w:t>5</w:t>
-            </w:r>
-          </w:p>
-        </w:tc>
-        <w:tc>
-          <w:tcPr>
-            <w:tcW w:type="dxa" w:w="1754"/>
-            <w:vAlign w:val="center"/>
-          </w:tcPr>
-          <w:p>
-            <w:pPr>
-              <w:keepNext/>
-              <w:spacing w:line="240" w:lineRule="auto" w:after="0"/>
-              <w:ind w:firstLine="0"/>
-              <w:jc w:val="left"/>
-            </w:pPr>
-            <w:r>
-              <w:rPr>
-                <w:rFonts w:ascii="Times New Roman" w:hAnsi="Times New Roman"/>
-                <w:sz w:val="17"/>
-              </w:rPr>
-              <w:t>19,87%</w:t>
-            </w:r>
-          </w:p>
-        </w:tc>
-        <w:tc>
-          <w:tcPr>
-            <w:tcW w:type="dxa" w:w="1169"/>
-            <w:vAlign w:val="center"/>
-          </w:tcPr>
-          <w:p>
-            <w:pPr>
-              <w:keepNext/>
-              <w:spacing w:line="240" w:lineRule="auto" w:after="0"/>
-              <w:ind w:firstLine="0"/>
-              <w:jc w:val="left"/>
-            </w:pPr>
-            <w:r>
-              <w:rPr>
-                <w:rFonts w:ascii="Times New Roman" w:hAnsi="Times New Roman"/>
-                <w:sz w:val="17"/>
-              </w:rPr>
-              <w:t>16,94%</w:t>
-            </w:r>
-          </w:p>
-        </w:tc>
-        <w:tc>
-          <w:tcPr>
-            <w:tcW w:type="dxa" w:w="1169"/>
-            <w:vAlign w:val="center"/>
-          </w:tcPr>
-          <w:p>
-            <w:pPr>
-              <w:keepNext/>
-              <w:spacing w:line="240" w:lineRule="auto" w:after="0"/>
-              <w:ind w:firstLine="0"/>
-              <w:jc w:val="left"/>
-            </w:pPr>
-            <w:r>
-              <w:rPr>
-                <w:rFonts w:ascii="Times New Roman" w:hAnsi="Times New Roman"/>
-                <w:sz w:val="17"/>
-              </w:rPr>
-              <w:t>−28,94%</w:t>
-            </w:r>
-          </w:p>
-        </w:tc>
-        <w:tc>
-          <w:tcPr>
-            <w:tcW w:type="dxa" w:w="1632"/>
+              <w:t>8</w:t>
+            </w:r>
+          </w:p>
+        </w:tc>
+        <w:tc>
+          <w:tcPr>
+            <w:tcW w:type="dxa" w:w="1664"/>
+            <w:vAlign w:val="center"/>
+          </w:tcPr>
+          <w:p>
+            <w:pPr>
+              <w:keepNext/>
+              <w:spacing w:line="240" w:lineRule="auto" w:after="0"/>
+              <w:ind w:firstLine="0"/>
+              <w:jc w:val="left"/>
+            </w:pPr>
+            <w:r>
+              <w:rPr>
+                <w:rFonts w:ascii="Times New Roman" w:hAnsi="Times New Roman"/>
+                <w:sz w:val="17"/>
+              </w:rPr>
+              <w:t>15,39%</w:t>
+            </w:r>
+          </w:p>
+        </w:tc>
+        <w:tc>
+          <w:tcPr>
+            <w:tcW w:type="dxa" w:w="1109"/>
+            <w:vAlign w:val="center"/>
+          </w:tcPr>
+          <w:p>
+            <w:pPr>
+              <w:keepNext/>
+              <w:spacing w:line="240" w:lineRule="auto" w:after="0"/>
+              <w:ind w:firstLine="0"/>
+              <w:jc w:val="left"/>
+            </w:pPr>
+            <w:r>
+              <w:rPr>
+                <w:rFonts w:ascii="Times New Roman" w:hAnsi="Times New Roman"/>
+                <w:sz w:val="17"/>
+              </w:rPr>
+              <w:t>10,51%</w:t>
+            </w:r>
+          </w:p>
+        </w:tc>
+        <w:tc>
+          <w:tcPr>
+            <w:tcW w:type="dxa" w:w="1109"/>
+            <w:vAlign w:val="center"/>
+          </w:tcPr>
+          <w:p>
+            <w:pPr>
+              <w:keepNext/>
+              <w:spacing w:line="240" w:lineRule="auto" w:after="0"/>
+              <w:ind w:firstLine="0"/>
+              <w:jc w:val="left"/>
+            </w:pPr>
+            <w:r>
+              <w:rPr>
+                <w:rFonts w:ascii="Times New Roman" w:hAnsi="Times New Roman"/>
+                <w:sz w:val="17"/>
+              </w:rPr>
+              <w:t>−17,88%</w:t>
+            </w:r>
+          </w:p>
+        </w:tc>
+        <w:tc>
+          <w:tcPr>
+            <w:tcW w:type="dxa" w:w="1505"/>
             <w:vAlign w:val="center"/>
           </w:tcPr>
           <w:p>
@@ -2043,43 +2043,43 @@
         </w:trPr>
         <w:tc>
           <w:tcPr>
-            <w:tcW w:type="dxa" w:w="1072"/>
-            <w:vAlign w:val="center"/>
-          </w:tcPr>
-          <w:p>
-            <w:pPr>
-              <w:keepNext/>
-              <w:spacing w:line="240" w:lineRule="auto" w:after="0"/>
-              <w:ind w:firstLine="0"/>
-              <w:jc w:val="left"/>
-            </w:pPr>
-            <w:r>
-              <w:rPr>
-                <w:rFonts w:ascii="Times New Roman" w:hAnsi="Times New Roman"/>
-                <w:sz w:val="17"/>
-              </w:rPr>
-              <w:t>Ibovespa</w:t>
-            </w:r>
-          </w:p>
-        </w:tc>
-        <w:tc>
-          <w:tcPr>
-            <w:tcW w:type="dxa" w:w="1364"/>
-            <w:vAlign w:val="center"/>
-          </w:tcPr>
-          <w:p>
-            <w:pPr>
-              <w:keepNext/>
-              <w:spacing w:line="240" w:lineRule="auto" w:after="0"/>
-              <w:ind w:firstLine="0"/>
-              <w:jc w:val="left"/>
-            </w:pPr>
-            <w:r>
-              <w:rPr>
-                <w:rFonts w:ascii="Times New Roman" w:hAnsi="Times New Roman"/>
-                <w:sz w:val="17"/>
-              </w:rPr>
-              <w:t>—</w:t>
+            <w:tcW w:type="dxa" w:w="1479"/>
+            <w:vAlign w:val="center"/>
+          </w:tcPr>
+          <w:p>
+            <w:pPr>
+              <w:keepNext/>
+              <w:spacing w:line="240" w:lineRule="auto" w:after="0"/>
+              <w:ind w:firstLine="0"/>
+              <w:jc w:val="left"/>
+            </w:pPr>
+            <w:r>
+              <w:rPr>
+                <w:rFonts w:ascii="Times New Roman" w:hAnsi="Times New Roman"/>
+                <w:sz w:val="17"/>
+              </w:rPr>
+              <w:t>Arrojado</w:t>
+            </w:r>
+          </w:p>
+        </w:tc>
+        <w:tc>
+          <w:tcPr>
+            <w:tcW w:type="dxa" w:w="1294"/>
+            <w:vAlign w:val="center"/>
+          </w:tcPr>
+          <w:p>
+            <w:pPr>
+              <w:keepNext/>
+              <w:spacing w:line="240" w:lineRule="auto" w:after="0"/>
+              <w:ind w:firstLine="0"/>
+              <w:jc w:val="left"/>
+            </w:pPr>
+            <w:r>
+              <w:rPr>
+                <w:rFonts w:ascii="Times New Roman" w:hAnsi="Times New Roman"/>
+                <w:sz w:val="17"/>
+              </w:rPr>
+              <w:t>75%</w:t>
             </w:r>
           </w:p>
         </w:tc>
@@ -2100,91 +2100,91 @@
                 <w:rFonts w:ascii="Times New Roman" w:hAnsi="Times New Roman"/>
                 <w:sz w:val="17"/>
               </w:rPr>
-              <w:t>—</w:t>
-            </w:r>
-          </w:p>
-        </w:tc>
-        <w:tc>
-          <w:tcPr>
-            <w:tcW w:type="dxa" w:w="1754"/>
-            <w:vAlign w:val="center"/>
-          </w:tcPr>
-          <w:p>
-            <w:pPr>
-              <w:keepNext/>
-              <w:spacing w:line="240" w:lineRule="auto" w:after="0"/>
-              <w:ind w:firstLine="0"/>
-              <w:jc w:val="left"/>
-            </w:pPr>
-            <w:r>
-              <w:rPr>
-                <w:rFonts w:ascii="Times New Roman" w:hAnsi="Times New Roman"/>
-                <w:sz w:val="17"/>
-              </w:rPr>
-              <w:t>11,74%</w:t>
-            </w:r>
-          </w:p>
-        </w:tc>
-        <w:tc>
-          <w:tcPr>
-            <w:tcW w:type="dxa" w:w="1169"/>
-            <w:vAlign w:val="center"/>
-          </w:tcPr>
-          <w:p>
-            <w:pPr>
-              <w:keepNext/>
-              <w:spacing w:line="240" w:lineRule="auto" w:after="0"/>
-              <w:ind w:firstLine="0"/>
-              <w:jc w:val="left"/>
-            </w:pPr>
-            <w:r>
-              <w:rPr>
-                <w:rFonts w:ascii="Times New Roman" w:hAnsi="Times New Roman"/>
-                <w:sz w:val="17"/>
-              </w:rPr>
-              <w:t>23,37%</w:t>
-            </w:r>
-          </w:p>
-        </w:tc>
-        <w:tc>
-          <w:tcPr>
-            <w:tcW w:type="dxa" w:w="1169"/>
-            <w:vAlign w:val="center"/>
-          </w:tcPr>
-          <w:p>
-            <w:pPr>
-              <w:keepNext/>
-              <w:spacing w:line="240" w:lineRule="auto" w:after="0"/>
-              <w:ind w:firstLine="0"/>
-              <w:jc w:val="left"/>
-            </w:pPr>
-            <w:r>
-              <w:rPr>
-                <w:rFonts w:ascii="Times New Roman" w:hAnsi="Times New Roman"/>
-                <w:sz w:val="17"/>
-              </w:rPr>
-              <w:t>−46,82%</w:t>
-            </w:r>
-          </w:p>
-        </w:tc>
-        <w:tc>
-          <w:tcPr>
-            <w:tcW w:type="dxa" w:w="1632"/>
-            <w:vAlign w:val="center"/>
-          </w:tcPr>
-          <w:p>
-            <w:pPr>
-              <w:keepNext/>
-              <w:spacing w:line="240" w:lineRule="auto" w:after="0"/>
-              <w:ind w:firstLine="0"/>
-              <w:jc w:val="left"/>
-            </w:pPr>
-            <w:r>
-              <w:rPr>
-                <w:rFonts w:ascii="Times New Roman" w:hAnsi="Times New Roman"/>
-                <w:sz w:val="17"/>
-              </w:rPr>
-              <w:t>—</w:t>
+              <w:t>5</w:t>
+            </w:r>
+          </w:p>
+        </w:tc>
+        <w:tc>
+          <w:tcPr>
+            <w:tcW w:type="dxa" w:w="1664"/>
+            <w:vAlign w:val="center"/>
+          </w:tcPr>
+          <w:p>
+            <w:pPr>
+              <w:keepNext/>
+              <w:spacing w:line="240" w:lineRule="auto" w:after="0"/>
+              <w:ind w:firstLine="0"/>
+              <w:jc w:val="left"/>
+            </w:pPr>
+            <w:r>
+              <w:rPr>
+                <w:rFonts w:ascii="Times New Roman" w:hAnsi="Times New Roman"/>
+                <w:sz w:val="17"/>
+              </w:rPr>
+              <w:t>19,79%</w:t>
+            </w:r>
+          </w:p>
+        </w:tc>
+        <w:tc>
+          <w:tcPr>
+            <w:tcW w:type="dxa" w:w="1109"/>
+            <w:vAlign w:val="center"/>
+          </w:tcPr>
+          <w:p>
+            <w:pPr>
+              <w:keepNext/>
+              <w:spacing w:line="240" w:lineRule="auto" w:after="0"/>
+              <w:ind w:firstLine="0"/>
+              <w:jc w:val="left"/>
+            </w:pPr>
+            <w:r>
+              <w:rPr>
+                <w:rFonts w:ascii="Times New Roman" w:hAnsi="Times New Roman"/>
+                <w:sz w:val="17"/>
+              </w:rPr>
+              <w:t>16,95%</w:t>
+            </w:r>
+          </w:p>
+        </w:tc>
+        <w:tc>
+          <w:tcPr>
+            <w:tcW w:type="dxa" w:w="1109"/>
+            <w:vAlign w:val="center"/>
+          </w:tcPr>
+          <w:p>
+            <w:pPr>
+              <w:keepNext/>
+              <w:spacing w:line="240" w:lineRule="auto" w:after="0"/>
+              <w:ind w:firstLine="0"/>
+              <w:jc w:val="left"/>
+            </w:pPr>
+            <w:r>
+              <w:rPr>
+                <w:rFonts w:ascii="Times New Roman" w:hAnsi="Times New Roman"/>
+                <w:sz w:val="17"/>
+              </w:rPr>
+              <w:t>−28,95%</w:t>
+            </w:r>
+          </w:p>
+        </w:tc>
+        <w:tc>
+          <w:tcPr>
+            <w:tcW w:type="dxa" w:w="1505"/>
+            <w:vAlign w:val="center"/>
+          </w:tcPr>
+          <w:p>
+            <w:pPr>
+              <w:keepNext/>
+              <w:spacing w:line="240" w:lineRule="auto" w:after="0"/>
+              <w:ind w:firstLine="0"/>
+              <w:jc w:val="left"/>
+            </w:pPr>
+            <w:r>
+              <w:rPr>
+                <w:rFonts w:ascii="Times New Roman" w:hAnsi="Times New Roman"/>
+                <w:sz w:val="17"/>
+              </w:rPr>
+              <w:t>8 de 11</w:t>
             </w:r>
           </w:p>
         </w:tc>
@@ -2195,7 +2195,159 @@
         </w:trPr>
         <w:tc>
           <w:tcPr>
-            <w:tcW w:type="dxa" w:w="1072"/>
+            <w:tcW w:type="dxa" w:w="1479"/>
+            <w:vAlign w:val="center"/>
+          </w:tcPr>
+          <w:p>
+            <w:pPr>
+              <w:keepNext/>
+              <w:spacing w:line="240" w:lineRule="auto" w:after="0"/>
+              <w:ind w:firstLine="0"/>
+              <w:jc w:val="left"/>
+            </w:pPr>
+            <w:r>
+              <w:rPr>
+                <w:rFonts w:ascii="Times New Roman" w:hAnsi="Times New Roman"/>
+                <w:sz w:val="17"/>
+              </w:rPr>
+              <w:t>Ibovespa</w:t>
+            </w:r>
+          </w:p>
+        </w:tc>
+        <w:tc>
+          <w:tcPr>
+            <w:tcW w:type="dxa" w:w="1294"/>
+            <w:vAlign w:val="center"/>
+          </w:tcPr>
+          <w:p>
+            <w:pPr>
+              <w:keepNext/>
+              <w:spacing w:line="240" w:lineRule="auto" w:after="0"/>
+              <w:ind w:firstLine="0"/>
+              <w:jc w:val="left"/>
+            </w:pPr>
+            <w:r>
+              <w:rPr>
+                <w:rFonts w:ascii="Times New Roman" w:hAnsi="Times New Roman"/>
+                <w:sz w:val="17"/>
+              </w:rPr>
+              <w:t>—</w:t>
+            </w:r>
+          </w:p>
+        </w:tc>
+        <w:tc>
+          <w:tcPr>
+            <w:tcW w:type="dxa" w:w="900"/>
+            <w:vAlign w:val="center"/>
+          </w:tcPr>
+          <w:p>
+            <w:pPr>
+              <w:keepNext/>
+              <w:spacing w:line="240" w:lineRule="auto" w:after="0"/>
+              <w:ind w:firstLine="0"/>
+              <w:jc w:val="left"/>
+            </w:pPr>
+            <w:r>
+              <w:rPr>
+                <w:rFonts w:ascii="Times New Roman" w:hAnsi="Times New Roman"/>
+                <w:sz w:val="17"/>
+              </w:rPr>
+              <w:t>—</w:t>
+            </w:r>
+          </w:p>
+        </w:tc>
+        <w:tc>
+          <w:tcPr>
+            <w:tcW w:type="dxa" w:w="1664"/>
+            <w:vAlign w:val="center"/>
+          </w:tcPr>
+          <w:p>
+            <w:pPr>
+              <w:keepNext/>
+              <w:spacing w:line="240" w:lineRule="auto" w:after="0"/>
+              <w:ind w:firstLine="0"/>
+              <w:jc w:val="left"/>
+            </w:pPr>
+            <w:r>
+              <w:rPr>
+                <w:rFonts w:ascii="Times New Roman" w:hAnsi="Times New Roman"/>
+                <w:sz w:val="17"/>
+              </w:rPr>
+              <w:t>11,74%</w:t>
+            </w:r>
+          </w:p>
+        </w:tc>
+        <w:tc>
+          <w:tcPr>
+            <w:tcW w:type="dxa" w:w="1109"/>
+            <w:vAlign w:val="center"/>
+          </w:tcPr>
+          <w:p>
+            <w:pPr>
+              <w:keepNext/>
+              <w:spacing w:line="240" w:lineRule="auto" w:after="0"/>
+              <w:ind w:firstLine="0"/>
+              <w:jc w:val="left"/>
+            </w:pPr>
+            <w:r>
+              <w:rPr>
+                <w:rFonts w:ascii="Times New Roman" w:hAnsi="Times New Roman"/>
+                <w:sz w:val="17"/>
+              </w:rPr>
+              <w:t>23,37%</w:t>
+            </w:r>
+          </w:p>
+        </w:tc>
+        <w:tc>
+          <w:tcPr>
+            <w:tcW w:type="dxa" w:w="1109"/>
+            <w:vAlign w:val="center"/>
+          </w:tcPr>
+          <w:p>
+            <w:pPr>
+              <w:keepNext/>
+              <w:spacing w:line="240" w:lineRule="auto" w:after="0"/>
+              <w:ind w:firstLine="0"/>
+              <w:jc w:val="left"/>
+            </w:pPr>
+            <w:r>
+              <w:rPr>
+                <w:rFonts w:ascii="Times New Roman" w:hAnsi="Times New Roman"/>
+                <w:sz w:val="17"/>
+              </w:rPr>
+              <w:t>−46,82%</w:t>
+            </w:r>
+          </w:p>
+        </w:tc>
+        <w:tc>
+          <w:tcPr>
+            <w:tcW w:type="dxa" w:w="1505"/>
+            <w:vAlign w:val="center"/>
+          </w:tcPr>
+          <w:p>
+            <w:pPr>
+              <w:keepNext/>
+              <w:spacing w:line="240" w:lineRule="auto" w:after="0"/>
+              <w:ind w:firstLine="0"/>
+              <w:jc w:val="left"/>
+            </w:pPr>
+            <w:r>
+              <w:rPr>
+                <w:rFonts w:ascii="Times New Roman" w:hAnsi="Times New Roman"/>
+                <w:sz w:val="17"/>
+              </w:rPr>
+              <w:t>—</w:t>
+            </w:r>
+          </w:p>
+        </w:tc>
+      </w:tr>
+      <w:tr>
+        <w:trPr>
+          <w:cantSplit/>
+        </w:trPr>
+        <w:tc>
+          <w:tcPr>
+            <w:tcW w:type="dxa" w:w="1479"/>
             <w:vAlign w:val="center"/>
           </w:tcPr>
           <w:p>
@@ -2210,13 +2362,13 @@
                 <w:rFonts w:ascii="Times New Roman" w:hAnsi="Times New Roman"/>
                 <w:sz w:val="17"/>
               </w:rPr>
-              <w:t>CDI</w:t>
-            </w:r>
-          </w:p>
-        </w:tc>
-        <w:tc>
-          <w:tcPr>
-            <w:tcW w:type="dxa" w:w="1364"/>
+              <w:t>Tesouro Selic</w:t>
+            </w:r>
+          </w:p>
+        </w:tc>
+        <w:tc>
+          <w:tcPr>
+            <w:tcW w:type="dxa" w:w="1294"/>
             <w:vAlign w:val="center"/>
           </w:tcPr>
           <w:p>
@@ -2258,7 +2410,7 @@
         </w:tc>
         <w:tc>
           <w:tcPr>
-            <w:tcW w:type="dxa" w:w="1754"/>
+            <w:tcW w:type="dxa" w:w="1664"/>
             <w:vAlign w:val="center"/>
           </w:tcPr>
           <w:p>
@@ -2273,13 +2425,13 @@
                 <w:rFonts w:ascii="Times New Roman" w:hAnsi="Times New Roman"/>
                 <w:sz w:val="17"/>
               </w:rPr>
-              <w:t>9,61%</w:t>
-            </w:r>
-          </w:p>
-        </w:tc>
-        <w:tc>
-          <w:tcPr>
-            <w:tcW w:type="dxa" w:w="1169"/>
+              <w:t>9,36%</w:t>
+            </w:r>
+          </w:p>
+        </w:tc>
+        <w:tc>
+          <w:tcPr>
+            <w:tcW w:type="dxa" w:w="1109"/>
             <w:vAlign w:val="center"/>
           </w:tcPr>
           <w:p>
@@ -2294,13 +2446,13 @@
                 <w:rFonts w:ascii="Times New Roman" w:hAnsi="Times New Roman"/>
                 <w:sz w:val="17"/>
               </w:rPr>
-              <w:t>0,25%</w:t>
-            </w:r>
-          </w:p>
-        </w:tc>
-        <w:tc>
-          <w:tcPr>
-            <w:tcW w:type="dxa" w:w="1169"/>
+              <w:t>0,29%</w:t>
+            </w:r>
+          </w:p>
+        </w:tc>
+        <w:tc>
+          <w:tcPr>
+            <w:tcW w:type="dxa" w:w="1109"/>
             <w:vAlign w:val="center"/>
           </w:tcPr>
           <w:p>
@@ -2315,13 +2467,13 @@
                 <w:rFonts w:ascii="Times New Roman" w:hAnsi="Times New Roman"/>
                 <w:sz w:val="17"/>
               </w:rPr>
-              <w:t>—</w:t>
-            </w:r>
-          </w:p>
-        </w:tc>
-        <w:tc>
-          <w:tcPr>
-            <w:tcW w:type="dxa" w:w="1632"/>
+              <w:t>−0,60%</w:t>
+            </w:r>
+          </w:p>
+        </w:tc>
+        <w:tc>
+          <w:tcPr>
+            <w:tcW w:type="dxa" w:w="1505"/>
             <w:vAlign w:val="center"/>
           </w:tcPr>
           <w:p>
@@ -2367,7 +2519,7 @@
         <w:pStyle w:val="Normal"/>
       </w:pPr>
       <w:r>
-        <w:t>Os três perfis preservam a ordenação declarada de risco: retorno e queda máxima crescem juntos do conservador ao arrojado, e nenhum perfil se aproximou da queda máxima do Ibovespa.</w:t>
+        <w:t>Os quatro perfis preservam a ordenação declarada de risco: retorno e queda máxima crescem juntos do ultraconservador ao arrojado, e nenhum se aproximou da queda máxima do Ibovespa. Só o ultraconservador fica abaixo do índice, o esperado de uma carteira com 4% em ações.</w:t>
       </w:r>
     </w:p>
     <w:p>
@@ -3317,7 +3469,7 @@
         <w:pStyle w:val="Normal"/>
       </w:pPr>
       <w:r>
-        <w:t>A coluna em reais traduz a taxa anualizada em escala econômica. Sob as hipóteses do diagnóstico, R$ 100 mil teriam terminado em R$ 609.832 na série do módulo de seleção, R$ 643.774 com a camada de proteção antes do imposto incremental, R$ 340.068 no Ibovespa e R$ 274.368 no CDI. Esses valores dependem da qualidade da série reconstruída e devem ser lidos junto com a Seção 5.2.</w:t>
+        <w:t>A coluna em reais traduz a taxa anualizada em escala econômica. Esses valores dependem da qualidade da série reconstruída e devem ser lidos junto com a Seção 5.2.</w:t>
       </w:r>
     </w:p>
     <w:p>
@@ -5382,7 +5534,7 @@
         <w:pStyle w:val="Normal"/>
       </w:pPr>
       <w:r>
-        <w:t>Proteção intranual concebida depois da Covid-19, com parâmetros escolhidos apenas em 2015–2018. Fora dessa janela, em 2019–2025, a diferença anual de retorno não foi detectável (p = 0,964): o efeito medido é de queda, não de retorno. No histórico completo a queda máxima recuou de 47,8% para 28,7% e o retorno anualizado subiu de 17,86% para 18,45%, e a Tabela 2 mantém as duas séries separadas para que a camada não se confunda com a seleção. Para R$ 100 mil, o imposto incremental das reduções foi de R$ 2.195, levando o valor terminal de R$ 643.774 para R$ 634.531. A camada integra a política declarada da Seção 3.4.</w:t>
+        <w:t>Proteção intranual concebida depois da Covid-19, com parâmetros escolhidos apenas em 2015–2018. Fora dessa janela, em 2019–2025, a diferença anual de retorno não foi detectável (p = 0,964): o efeito medido é de queda, não de retorno. No histórico completo a queda máxima recuou de 47,8% para 28,7% e o retorno anualizado subiu de 17,86% para 18,45%, e a Tabela 2 mantém as duas séries separadas. Para R$ 100 mil, o imposto incremental das reduções foi de R$ 2.195, levando o valor terminal de R$ 643.774 para R$ 634.531. A camada integra a política declarada da Seção 3.4.</w:t>
       </w:r>
     </w:p>
     <w:p>
@@ -7299,7 +7451,7 @@
         <w:pStyle w:val="Normal"/>
       </w:pPr>
       <w:r>
-        <w:t>No diagnóstico 2015–2025, os três perfis superaram o caixa em oito de onze anos cada um, com quedas escalonadas conforme o perfil; a incerteza amostral e a imputação parcial impedem tratar isso como superioridade comprovada. Os negativos são parte da contribuição: reselecionar mais vezes não ajudou, o modelo de linguagem não acrescentou retorno, a alocação direta por texto saiu aritmeticamente inconsistente em parte dos anos e a própria busca se degradou ao ser ampliada. O conjunto justifica um sistema em que a regra calcula, a linguagem explica e uma pessoa responde.</w:t>
+        <w:t>No diagnóstico 2015–2025, os quatro perfis superaram o CDI em oito de onze anos cada um, com quedas escalonadas conforme o perfil; a incerteza amostral e a imputação parcial impedem tratar isso como superioridade comprovada. Os negativos são parte da contribuição: reselecionar mais vezes não ajudou, o modelo de linguagem não acrescentou retorno, a alocação direta por texto saiu aritmeticamente inconsistente em parte dos anos e a própria busca se degradou ao ser ampliada. O conjunto justifica um sistema em que a regra calcula, a linguagem explica e uma pessoa responde.</w:t>
       </w:r>
     </w:p>
     <w:p>

</xml_diff>

<commit_message>
artigo: converte o manuscrito do BTech para o publico pessoa fisica
O site ja foi convertido; o artigo ainda descrevia o desenho B2B em seis
passagens: objetivo, publico, motivacao, o paragrafo da CVM, a discussao
de produto e as limitacoes. O texto agora diz que o artefato aplica uma
politica declarada e igual para todos, que a carteira de cada perfil e a
mesma para quem nele se enquadra e que o enquadramento e regra
deterministica publicada, nao avaliacao individual - o mesmo
enquadramento que o parecer juridico aprovou para o site.

Para caber no limite de 8.000 palavras (o texto convertido chegou a
8.086), foram removidas repeticoes entre secoes: a ressalva do retorno
passado, que ja aparece no resumo e na conclusao, e clausulas duplicadas
no fluxo operacional e na discussao. Manuscrito em 7.995 palavras;
DOCX e PDF reconstruidos. 697 testes e os tres verificadores passam.
</commit_message>
<xml_diff>
--- a/outputs/Benevente_BTECH_Final.docx
+++ b/outputs/Benevente_BTECH_Final.docx
@@ -91,15 +91,15 @@
         <w:pStyle w:val="Normal"/>
       </w:pPr>
       <w:r>
-        <w:t>O problema é operacional: a recomendação é produzida hoje e defendida anos depois; sem preservar dado, versão da regra e aprovação, a justificativa posterior incorpora informação que não existia. O Benevente produz proposta e registro verificável no mesmo fluxo.</w:t>
-      </w:r>
-    </w:p>
-    <w:p>
-      <w:pPr>
-        <w:pStyle w:val="Normal"/>
-      </w:pPr>
-      <w:r>
-        <w:t>Quando um cliente pergunta por que uma ação entrou na carteira anos antes, o escritório precisa demonstrar três coisas.</w:t>
+        <w:t>O problema é operacional: a decisão é tomada hoje e defendida anos depois; sem preservar dado, versão da regra e aprovação, a justificativa posterior incorpora informação que não existia. O Benevente produz proposta e registro verificável no mesmo fluxo.</w:t>
+      </w:r>
+    </w:p>
+    <w:p>
+      <w:pPr>
+        <w:pStyle w:val="Normal"/>
+      </w:pPr>
+      <w:r>
+        <w:t>Quando alguém pergunta por que uma ação entrou na carteira anos antes, quem decidiu precisa demonstrar três coisas.</w:t>
       </w:r>
     </w:p>
     <w:p>
@@ -112,7 +112,7 @@
         </w:numPr>
       </w:pPr>
       <w:r>
-        <w:t>Quais dados existiam naquela data: um balanço republicado em 2024 não pode aparecer como disponível em janeiro de 2023, e sem data de recebimento a justificativa incorpora informação que ninguém tinha.</w:t>
+        <w:t>Quais dados existiam naquela data: um balanço republicado em 2024 não pode aparecer como disponível em janeiro de 2023.</w:t>
       </w:r>
     </w:p>
     <w:p>
@@ -162,7 +162,7 @@
         <w:pStyle w:val="Normal"/>
       </w:pPr>
       <w:r>
-        <w:t>O objetivo é construir e avaliar um artefato B2B que transforme cada recomendação em documento verificável, pelo método do design science: identificar o problema, explicitar requisitos, construir e avaliar por utilidade, qualidade e evidência (Hevner et al., 2004; Peffers et al., 2007). A avaliação combina testes, inspeção das fontes, busca deliberada de erros e diagnóstico histórico. A contribuição não é a trilha de auditoria com hash e separação de papéis, que já é padrão, e sim ligá-la a um protocolo congelado antes do período avaliado, com critério de falseamento e início da amostra confirmatória declarados. Trilhas registram o que houve; esta se compromete de antemão com o que contaria como fracasso. O retorno passado mede o comportamento do protótipo, não sua utilidade nem o desempenho futuro.</w:t>
+        <w:t>O objetivo é construir e avaliar um artefato que transforme cada decisão de carteira em documento verificável, pelo método do design science: identificar o problema, explicitar requisitos, construir e avaliar por utilidade, qualidade e evidência (Hevner et al., 2004; Peffers et al., 2007). A avaliação combina testes, inspeção das fontes, busca deliberada de erros e diagnóstico histórico. A contribuição não é a trilha de auditoria com hash e separação de papéis, que já é padrão, e sim ligá-la a um protocolo congelado antes do período avaliado, com critério de falseamento e início da amostra confirmatória declarados. Trilhas registram o que houve; esta se compromete de antemão com o que contaria como fracasso.</w:t>
       </w:r>
     </w:p>
     <w:p>
@@ -178,7 +178,7 @@
         <w:pStyle w:val="Normal"/>
       </w:pPr>
       <w:r>
-        <w:t>O público inicial são escritórios de investimento, consultorias de valores mobiliários e gestão patrimonial que precisam recomendar, revisar e defender carteiras: preservar o contexto da decisão, demonstrar por que cada ativo entrou ou não, e comparar com alternativas reconhecíveis pelo cliente. O piloto comercial proposto, descrito na Seção 6.3, medirá o problema e a utilidade do artefato, sem presumir efeito sobre a economia local.</w:t>
+        <w:t>O público é o investidor que decide a própria carteira e quer poder reconstruir a decisão depois: preservar o contexto em que ela foi tomada, saber por que cada ativo entrou ou não, e comparar com alternativas reconhecíveis. O artefato não recomenda a ninguém em particular. Ele aplica uma política declarada, idêntica para todos, e a carteira de cada perfil é a mesma para quem nele se enquadra; o enquadramento é regra determinística publicada, não avaliação individual. O piloto da Seção 6.3 medirá o problema e a utilidade do artefato.</w:t>
       </w:r>
     </w:p>
     <w:p>
@@ -228,7 +228,7 @@
         <w:pStyle w:val="Normal"/>
       </w:pPr>
       <w:r>
-        <w:t>Essas escolhas definem o tipo de evidência que o trabalho pode produzir. O backtest é um experimento histórico sobre um protocolo, não uma simulação da experiência de cada cliente, cuja carteira implementável depende de suitability, liquidez, tributação e restrições contratuais. O artefato separa, por isso, a regra que mede o sinal, a política institucional que limita o risco e o texto explicativo que apoia a revisão humana.</w:t>
+        <w:t>Essas escolhas definem o tipo de evidência que o trabalho pode produzir. O backtest é um experimento histórico sobre um protocolo, não a experiência de uma pessoa, cuja carteira implementável depende de liquidez, tributação e restrições próprias. O artefato separa, por isso, a regra que mede o sinal, a política institucional que limita o risco e o texto explicativo que apoia a revisão humana.</w:t>
       </w:r>
     </w:p>
     <w:p>
@@ -1056,7 +1056,7 @@
         <w:pStyle w:val="Normal"/>
       </w:pPr>
       <w:r>
-        <w:t>Quatro mecanismos delimitam o que o software pode fazer. Eles transformam a prestação de contas algorítmica em propriedade do desenho, e não em explicação produzida depois do fato (Kroll et al., 2017). A aprovação humana e o enquadramento ao perfil também são coerentes com a Resolução CVM nº 30, enquanto qualquer uso como consultoria individualizada depende da estrutura autorizada prevista na Resolução CVM nº 19 (Comissão de Valores Mobiliários, 2021a, 2021b).</w:t>
+        <w:t>Quatro mecanismos delimitam o que o software pode fazer. Eles transformam a prestação de contas algorítmica em propriedade do desenho, e não em explicação produzida depois do fato (Kroll et al., 2017). A aprovação humana e o enquadramento por perfil são coerentes com a Resolução CVM nº 30; e o desenho mantém o artefato fora da consultoria individualizada, que exigiria a estrutura autorizada da Resolução CVM nº 19, porque a política é pública e igual para todos, o enquadramento é regra determinística e nenhuma orientação é produzida em função do caso de uma pessoa (Comissão de Valores Mobiliários, 2021a, 2021b).</w:t>
       </w:r>
     </w:p>
     <w:p>
@@ -6685,7 +6685,7 @@
         <w:pStyle w:val="Normal"/>
       </w:pPr>
       <w:r>
-        <w:t>O produto foi concebido para escritórios de investimento, consultorias e gestores patrimoniais. A política aplicada, os dados e seus hashes, a elegibilidade, os pesos, as ordens, o custo estimado e a aprovação permanecem ligados à mesma decisão, o que reduz o tempo de reconstrução e permite responder por que um papel entrou e por que outro ficou de fora. O valor a testar está na consistência do processo e na revisão, não em promessa de superar o mercado.</w:t>
+        <w:t>O produto foi concebido para quem decide a própria carteira. A política aplicada, os dados e seus hashes, a elegibilidade, os pesos, as ordens, o custo estimado e a aprovação permanecem ligados à mesma decisão, o que reduz o tempo de reconstrução e mostra por que um papel entrou e outro não.</w:t>
       </w:r>
     </w:p>
     <w:p>
@@ -6701,7 +6701,7 @@
         <w:pStyle w:val="Normal"/>
       </w:pPr>
       <w:r>
-        <w:t>O uso começa pelo perfil declarado adequado ao cliente. O usuário vê quais arquivos estavam disponíveis e quais passaram na validação; a triagem mostra aprovados e reprovados com o motivo; a carteira candidata apresenta pesos, parcela defensiva, custo e comparação com CDI, Ibovespa e MVO. O profissional revisa a tese, registra riscos, aprova ou rejeita e justifica; o dossiê reúne esse percurso com a versão da regra.</w:t>
+        <w:t>O uso começa pelo enquadramento em um dos quatro perfis. Quem decide vê quais arquivos estavam disponíveis e quais passaram na validação; a triagem mostra aprovados e reprovados com o motivo; a carteira candidata apresenta pesos, parcela defensiva, custo e comparação com CDI, Ibovespa e MVO. Em seguida revisa a tese, registra riscos, aprova ou rejeita e justifica; o dossiê reúne esse percurso com a versão da regra.</w:t>
       </w:r>
     </w:p>
     <w:p>
@@ -6717,7 +6717,7 @@
         <w:pStyle w:val="Normal"/>
       </w:pPr>
       <w:r>
-        <w:t>A implantação começa por fontes, políticas, acessos e aprovadores. No piloto o sistema acompanha poucas carteiras sem enviar ordens, e os dossiês são confrontados com o processo vigente; a conciliação de custos e posições fecha o ciclo. O piloto medirá tempo, completude da evidência, revisões, divergência de custos e disposição a pagar; é lá que a intensidade do problema se mede. O produto permanece em protótipo, com hashes versionados e data carimbada por terceiro.</w:t>
+        <w:t>No piloto o sistema acompanha poucas carteiras sem enviar ordens, e os dossiês são confrontados com o que o usuário faria sem ele; a conciliação de custos e posições fecha o ciclo. O piloto medirá tempo, completude da evidência, revisões, divergência de custos e disposição a pagar; é lá que a intensidade do problema se mede. O produto permanece em protótipo, com hashes versionados e data carimbada por terceiro.</w:t>
       </w:r>
     </w:p>
     <w:p>
@@ -7411,7 +7411,7 @@
         <w:pStyle w:val="Normal"/>
       </w:pPr>
       <w:r>
-        <w:t>Por fim, o produto não elimina responsabilidade profissional: uso comercial exige enquadramento regulatório, suitability, segurança, contrato de fontes e aprovação humana. O modelo de linguagem não seleciona ativos nem define pesos, e o radar de notícias serve apenas ao alerta humano, sem participar do retorno histórico.</w:t>
+        <w:t>Por fim, o produto não transfere responsabilidade: a decisão, a ordem e o risco continuam de quem usa, e o artefato é ferramenta de apoio, não recomendação individual nem promessa de resultado. Uso comercial exige enquadramento regulatório, segurança e contrato de fontes. O radar de notícias serve apenas ao alerta humano, sem participar do retorno histórico.</w:t>
       </w:r>
     </w:p>
     <w:p>
@@ -7459,7 +7459,7 @@
         <w:pStyle w:val="Normal"/>
       </w:pPr>
       <w:r>
-        <w:t>A conclusão sustentada pela evidência é estreita. O artefato cria uma cadeia auditável e a usa para achar erros que alteram o próprio resultado — inclusive recusando um selo que os dados não sustentavam e trocando um caixa que não era comprável — e para medir o limite do próprio procedimento de seleção. A viabilidade comercial depende de um piloto que meça ganho de tempo, completude documental, compreensão e disposição a pagar. A validade financeira exigirá uma base histórica reconciliável e observações posteriores aos registros congelados; a amostra confirmatória da política vigente começa no primeiro pregão de 2027. Até lá, o desempenho histórico permanece diagnóstico de desenvolvimento.</w:t>
+        <w:t>A conclusão sustentada pela evidência é estreita. O artefato cria uma cadeia auditável e a usa para achar erros que alteram o próprio resultado — inclusive recusando um selo que os dados não sustentavam e trocando um caixa que não era comprável — e para medir o limite do próprio procedimento de seleção. A viabilidade comercial depende do piloto da Seção 6.3. A validade financeira exigirá uma base histórica reconciliável e observações posteriores aos registros congelados; a amostra confirmatória da política vigente começa no primeiro pregão de 2027. Até lá, o desempenho histórico permanece diagnóstico de desenvolvimento.</w:t>
       </w:r>
     </w:p>
     <w:p>

</xml_diff>